<commit_message>
Roadmap: mark items 16 & 17 done; regenerate Word version
</commit_message>
<xml_diff>
--- a/RPJF-Roadmap.docx
+++ b/RPJF-Roadmap.docx
@@ -45,7 +45,7 @@
           <w:sz w:val="18"/>
           <w:szCs w:val="18"/>
         </w:rPr>
-        <w:t xml:space="preserve">Righteousness Peace and Joy Fellowship  ·  Updated 4 August 2026</w:t>
+        <w:t xml:space="preserve">Righteousness Peace and Joy Fellowship  ·  Updated 6 August 2026</w:t>
       </w:r>
     </w:p>
     <w:p>
@@ -257,7 +257,7 @@
         <w:rPr>
           <w:color w:val="333333"/>
         </w:rPr>
-        <w:t xml:space="preserve">Added .gitattributes and a line-endings fix, .editorconfig, .gitignore, a README, and branch protection on main.</w:t>
+        <w:t xml:space="preserve">.gitattributes + line-endings fix, .editorconfig, .gitignore, README, branch protection on main.</w:t>
       </w:r>
     </w:p>
     <w:p>
@@ -405,7 +405,7 @@
         <w:rPr>
           <w:color w:val="333333"/>
         </w:rPr>
-        <w:t xml:space="preserve">Accordion cards, split family/person search, couple only when linked, and a grouping helper; the spouse link also de-duplicates anniversaries in Celebrations.</w:t>
+        <w:t xml:space="preserve">Accordion cards, split family/person search, couple only when linked, grouping helper; the spouse link also de-duplicates anniversaries in Celebrations.</w:t>
       </w:r>
     </w:p>
     <w:p>
@@ -479,7 +479,7 @@
         <w:rPr>
           <w:color w:val="333333"/>
         </w:rPr>
-        <w:t xml:space="preserve">Service description, per-service member search, a by-individual attendance view in Analytics (tick/X per service, attended/missed/rate, sort, sticky name), distinct-member monthly charts by service type and age group, turnout %, lowest-attendance and least-attended cards, a by-month/by-date toggle, and the &gt;1000-row attendance load fix.</w:t>
+        <w:t xml:space="preserve">Service description, per-service member search, a by-individual attendance view in Analytics, distinct-member monthly charts, turnout %, lowest / least-attended cards, a by-month/by-date toggle, and the &gt;1000-row attendance load fix.</w:t>
       </w:r>
     </w:p>
     <w:p>
@@ -544,7 +544,7 @@
         <w:rPr>
           <w:color w:val="333333"/>
         </w:rPr>
-        <w:t xml:space="preserve">By-usher progress table no longer clips usher names on mobile; Families card names wrap; Celebrations no longer overflows page width; Import “Roster Check” renamed to “Uncaptured Members”; and the Celebrations anniversary icon changed from a heart to a ring.</w:t>
+        <w:t xml:space="preserve">By-usher table no longer clips usher names on mobile; Families card names wrap; Celebrations no longer overflows; Import “Roster Check” renamed to “Uncaptured Members”; anniversary icon changed from a heart to a ring.</w:t>
       </w:r>
     </w:p>
     <w:p>
@@ -581,7 +581,7 @@
         <w:rPr>
           <w:color w:val="333333"/>
         </w:rPr>
-        <w:t xml:space="preserve">“Slipping Away” kept on a 28-day window with an in-app explanation, plus a new “Inactive Candidates” list (active members whose last attendance was 90+ days ago) with an admin one-click “Mark inactive”. By-Member view also gained sort by name/attended/missed/rate with an ascending/descending toggle.</w:t>
+        <w:t xml:space="preserve">“Slipping Away” on a 28-day window with an in-app explanation, plus an “Inactive Candidates” list (90+ days lapsed) with a one-click “Mark inactive”. By-Member view gained sort by name/attended/missed/rate.</w:t>
       </w:r>
     </w:p>
     <w:p>
@@ -632,7 +632,7 @@
         <w:rPr>
           <w:color w:val="333333"/>
         </w:rPr>
-        <w:t xml:space="preserve">Editable service types (create / rename / remove, an inline “+ New type” when creating a service, and a standalone Service Types manager); a service’s description surfaced and editable at any time; attendance search by family as well as by name (separate name + family filters); and a By Family attendance grid in Analytics (members × services, present/absent, per-member + household rate). Roster occupancy / capacity view shelved for later.</w:t>
+        <w:t xml:space="preserve">Editable service types (create / rename / remove, inline “+ New type”, standalone manager); a service’s description surfaced and editable at any time; attendance search by family; and a By Family attendance grid in Analytics. Roster occupancy / capacity view shelved for later.</w:t>
       </w:r>
     </w:p>
     <w:p>
@@ -669,7 +669,7 @@
         <w:rPr>
           <w:color w:val="333333"/>
         </w:rPr>
-        <w:t xml:space="preserve">Both tabs now have separate person and family filters (multi-select), Ministries adds a ministry filter and Skills keeps its skill filter, and admins can set a member’s Leader / Co-Leader position directly from the Ministries page via a per-member popover.</w:t>
+        <w:t xml:space="preserve">Both tabs gained separate person and family filters (multi-select), and admins can set a member’s Leader / Co-Leader position directly from the Ministries page.</w:t>
       </w:r>
     </w:p>
     <w:p>
@@ -696,6 +696,80 @@
         <w:rPr>
           <w:b/>
           <w:bCs/>
+          <w:color w:val="2e8b57"/>
+          <w:sz w:val="18"/>
+          <w:szCs w:val="18"/>
+        </w:rPr>
+        <w:t xml:space="preserve">[Done]  </w:t>
+      </w:r>
+      <w:r>
+        <w:rPr>
+          <w:color w:val="333333"/>
+        </w:rPr>
+        <w:t xml:space="preserve">Slide-out filter drawer with extra filters (marital, attends, skill, age range); sticky header; stat tiles with change badges + sparklines; average reference lines + filled areas; Chart/Grid small-multiples toggle; an attendance heatmap; stable per-service-type colours everywhere; a reworked Members subtab; a new Musicians tab; and a new Data completeness tab.</w:t>
+      </w:r>
+    </w:p>
+    <w:p>
+      <w:pPr>
+        <w:spacing w:after="120"/>
+      </w:pPr>
+      <w:r>
+        <w:rPr>
+          <w:b/>
+          <w:bCs/>
+          <w:color w:val="222222"/>
+        </w:rPr>
+        <w:t xml:space="preserve">17. </w:t>
+      </w:r>
+      <w:r>
+        <w:rPr>
+          <w:b/>
+          <w:bCs/>
+          <w:color w:val="222222"/>
+        </w:rPr>
+        <w:t xml:space="preserve">Revise the individual member view. </w:t>
+      </w:r>
+      <w:r>
+        <w:rPr>
+          <w:b/>
+          <w:bCs/>
+          <w:color w:val="2e8b57"/>
+          <w:sz w:val="18"/>
+          <w:szCs w:val="18"/>
+        </w:rPr>
+        <w:t xml:space="preserve">[Done]  </w:t>
+      </w:r>
+      <w:r>
+        <w:rPr>
+          <w:color w:val="333333"/>
+        </w:rPr>
+        <w:t xml:space="preserve">Member detail is now a centered popout modal (was a side panel), Edit / Delete at the top; clicking a member anywhere jumps to the Members tab and highlights that person’s row; the detail shows the household with clickable family members and spouse, and switching between them resets the scroll. (Tap-to-call / tap-to-email deferred to the communication work, #20.)</w:t>
+      </w:r>
+    </w:p>
+    <w:p>
+      <w:pPr>
+        <w:spacing w:after="120"/>
+      </w:pPr>
+      <w:r>
+        <w:rPr>
+          <w:b/>
+          <w:bCs/>
+          <w:color w:val="222222"/>
+        </w:rPr>
+        <w:t xml:space="preserve">18. </w:t>
+      </w:r>
+      <w:r>
+        <w:rPr>
+          <w:b/>
+          <w:bCs/>
+          <w:color w:val="222222"/>
+        </w:rPr>
+        <w:t xml:space="preserve">App shell &amp; branding polish. </w:t>
+      </w:r>
+      <w:r>
+        <w:rPr>
+          <w:b/>
+          <w:bCs/>
           <w:color w:val="6b7280"/>
           <w:sz w:val="18"/>
           <w:szCs w:val="18"/>
@@ -706,81 +780,7 @@
         <w:rPr>
           <w:color w:val="333333"/>
         </w:rPr>
-        <w:t xml:space="preserve">Move filters into a collapsible side panel; add the prototyped visualization upgrades (attendance heatmap, average reference lines, change badges, fixed per-type colours); finish any remaining useful views.</w:t>
-      </w:r>
-    </w:p>
-    <w:p>
-      <w:pPr>
-        <w:spacing w:after="120"/>
-      </w:pPr>
-      <w:r>
-        <w:rPr>
-          <w:b/>
-          <w:bCs/>
-          <w:color w:val="222222"/>
-        </w:rPr>
-        <w:t xml:space="preserve">17. </w:t>
-      </w:r>
-      <w:r>
-        <w:rPr>
-          <w:b/>
-          <w:bCs/>
-          <w:color w:val="222222"/>
-        </w:rPr>
-        <w:t xml:space="preserve">Revise the individual member view. </w:t>
-      </w:r>
-      <w:r>
-        <w:rPr>
-          <w:b/>
-          <w:bCs/>
-          <w:color w:val="c07a1e"/>
-          <w:sz w:val="18"/>
-          <w:szCs w:val="18"/>
-        </w:rPr>
-        <w:t xml:space="preserve">[In progress]  </w:t>
-      </w:r>
-      <w:r>
-        <w:rPr>
-          <w:color w:val="333333"/>
-        </w:rPr>
-        <w:t xml:space="preserve">Member detail is now a centered popout modal (was a side panel), with Edit / Delete moved to the top; clicking a member anywhere jumps to the Members tab and highlights that person’s row instead of landing at the top of the list; the detail shows the household with clickable family members and spouse, and switching between them resets the popout scroll. Remaining: any further rework of the interaction panel.</w:t>
-      </w:r>
-    </w:p>
-    <w:p>
-      <w:pPr>
-        <w:spacing w:after="120"/>
-      </w:pPr>
-      <w:r>
-        <w:rPr>
-          <w:b/>
-          <w:bCs/>
-          <w:color w:val="222222"/>
-        </w:rPr>
-        <w:t xml:space="preserve">18. </w:t>
-      </w:r>
-      <w:r>
-        <w:rPr>
-          <w:b/>
-          <w:bCs/>
-          <w:color w:val="222222"/>
-        </w:rPr>
-        <w:t xml:space="preserve">App shell &amp; branding polish. </w:t>
-      </w:r>
-      <w:r>
-        <w:rPr>
-          <w:b/>
-          <w:bCs/>
-          <w:color w:val="6b7280"/>
-          <w:sz w:val="18"/>
-          <w:szCs w:val="18"/>
-        </w:rPr>
-        <w:t xml:space="preserve">[Planned]  </w:t>
-      </w:r>
-      <w:r>
-        <w:rPr>
-          <w:color w:val="333333"/>
-        </w:rPr>
-        <w:t xml:space="preserve">A title / splash screen, and collapsible / expandable navigation (drawer).</w:t>
+        <w:t xml:space="preserve">A title / splash screen, and collapsible / expandable navigation (drawer). This is the next unstarted item.</w:t>
       </w:r>
     </w:p>
     <w:p>
@@ -920,21 +920,7 @@
         <w:rPr>
           <w:color w:val="333333"/>
         </w:rPr>
-        <w:t xml:space="preserve">Roster occupancy / capacity view (split out of #14). Track how full a service / roster is against a capacity figure. Shelved August 2026 for a later pass.</w:t>
-      </w:r>
-    </w:p>
-    <w:p>
-      <w:pPr>
-        <w:pStyle w:val="Heading1"/>
-        <w:spacing w:after="120" w:before="260"/>
-      </w:pPr>
-      <w:r>
-        <w:rPr>
-          <w:b/>
-          <w:bCs/>
-          <w:color w:val="2a5357"/>
-        </w:rPr>
-        <w:t xml:space="preserve">Notes</w:t>
+        <w:t xml:space="preserve">Roster occupancy / capacity view (split out of #14). Track how full a service / roster is against a capacity figure.</w:t>
       </w:r>
     </w:p>
     <w:p>
@@ -950,7 +936,7 @@
         <w:rPr>
           <w:color w:val="333333"/>
         </w:rPr>
-        <w:t xml:space="preserve">“Slipping Away” already existed in Analytics; #13 refined it and added the inactive flag.</w:t>
+        <w:t xml:space="preserve">Member quick-action popover. Clicking a member opens a small anchored popover with a mini profile and access-gated actions (View details, Edit, Call / Email, View family) instead of navigating away; also gives lower-access accounts a read-only quick-look.</w:t>
       </w:r>
     </w:p>
     <w:p>
@@ -966,7 +952,69 @@
         <w:rPr>
           <w:color w:val="333333"/>
         </w:rPr>
-        <w:t xml:space="preserve">Much of the original “improve analytics” work was delivered in #11; #16 is the remaining polish.</w:t>
+        <w:t xml:space="preserve">Ministry Health + per-ministry staffing targets. An analytics card flagging ministries that need a leader or more people, driven by an admin-set “needs at least N” target per ministry (new table + a Ministries-page editor). A fixed-threshold version was built and removed.</w:t>
+      </w:r>
+    </w:p>
+    <w:p>
+      <w:pPr>
+        <w:pStyle w:val="Heading1"/>
+        <w:spacing w:after="120" w:before="260"/>
+      </w:pPr>
+      <w:r>
+        <w:rPr>
+          <w:b/>
+          <w:bCs/>
+          <w:color w:val="2a5357"/>
+        </w:rPr>
+        <w:t xml:space="preserve">Notes</w:t>
+      </w:r>
+    </w:p>
+    <w:p>
+      <w:pPr>
+        <w:pStyle w:val="ListParagraph"/>
+        <w:numPr>
+          <w:ilvl w:val="0"/>
+          <w:numId w:val="1"/>
+        </w:numPr>
+        <w:spacing w:after="90"/>
+      </w:pPr>
+      <w:r>
+        <w:rPr>
+          <w:color w:val="333333"/>
+        </w:rPr>
+        <w:t xml:space="preserve">“Slipping Away” already existed in Analytics; #13 refined it and added the inactive flag.</w:t>
+      </w:r>
+    </w:p>
+    <w:p>
+      <w:pPr>
+        <w:pStyle w:val="ListParagraph"/>
+        <w:numPr>
+          <w:ilvl w:val="0"/>
+          <w:numId w:val="1"/>
+        </w:numPr>
+        <w:spacing w:after="90"/>
+      </w:pPr>
+      <w:r>
+        <w:rPr>
+          <w:color w:val="333333"/>
+        </w:rPr>
+        <w:t xml:space="preserve">Analytics (#16) is complete — the original “improve analytics” work plus the polish pass.</w:t>
+      </w:r>
+    </w:p>
+    <w:p>
+      <w:pPr>
+        <w:pStyle w:val="ListParagraph"/>
+        <w:numPr>
+          <w:ilvl w:val="0"/>
+          <w:numId w:val="1"/>
+        </w:numPr>
+        <w:spacing w:after="90"/>
+      </w:pPr>
+      <w:r>
+        <w:rPr>
+          <w:color w:val="333333"/>
+        </w:rPr>
+        <w:t xml:space="preserve">The next unstarted item is #18 (app shell &amp; branding: splash screen + collapsible nav drawer); #19–22 are the larger later builds.</w:t>
       </w:r>
     </w:p>
     <w:p>

</xml_diff>